<commit_message>
made the fill in the form work
</commit_message>
<xml_diff>
--- a/LetterOfNotice.docx
+++ b/LetterOfNotice.docx
@@ -219,16 +219,16 @@
           <w:lang w:val="en-US"/>
         </w:rPr>
         <w:drawing>
-          <wp:anchor distT="0" distB="0" distL="114300" distR="114300" simplePos="0" relativeHeight="251659264" behindDoc="0" locked="0" layoutInCell="1" allowOverlap="1" wp14:anchorId="4C05D793" wp14:editId="23BAF9A0">
+          <wp:anchor distT="0" distB="0" distL="114300" distR="114300" simplePos="0" relativeHeight="251659264" behindDoc="0" locked="0" layoutInCell="1" allowOverlap="1" wp14:anchorId="4C05D793" wp14:editId="2ECCC9DA">
             <wp:simplePos x="0" y="0"/>
             <wp:positionH relativeFrom="page">
-              <wp:align>right</wp:align>
+              <wp:align>left</wp:align>
             </wp:positionH>
             <wp:positionV relativeFrom="paragraph">
-              <wp:posOffset>6525895</wp:posOffset>
+              <wp:posOffset>4846545</wp:posOffset>
             </wp:positionV>
-            <wp:extent cx="2761615" cy="971550"/>
-            <wp:effectExtent l="0" t="0" r="635" b="0"/>
+            <wp:extent cx="7562215" cy="2660425"/>
+            <wp:effectExtent l="0" t="0" r="635" b="6985"/>
             <wp:wrapNone/>
             <wp:docPr id="1232854306" name="Picture 6"/>
             <wp:cNvGraphicFramePr>
@@ -259,7 +259,7 @@
                   <pic:spPr bwMode="auto">
                     <a:xfrm>
                       <a:off x="0" y="0"/>
-                      <a:ext cx="2761615" cy="971550"/>
+                      <a:ext cx="7562215" cy="2660425"/>
                     </a:xfrm>
                     <a:prstGeom prst="rect">
                       <a:avLst/>
@@ -277,6 +277,9 @@
                 </pic:pic>
               </a:graphicData>
             </a:graphic>
+            <wp14:sizeRelH relativeFrom="margin">
+              <wp14:pctWidth>0</wp14:pctWidth>
+            </wp14:sizeRelH>
             <wp14:sizeRelV relativeFrom="margin">
               <wp14:pctHeight>0</wp14:pctHeight>
             </wp14:sizeRelV>

</xml_diff>